<commit_message>
Docs: speech rewritten in B2 English + technical Q&A section
Co-Authored-By: Claude Fable 5 <noreply@anthropic.com>
</commit_message>
<xml_diff>
--- a/docs/GECX_AI_Auto_Broker_Presentation_Speech.docx
+++ b/docs/GECX_AI_Auto_Broker_Presentation_Speech.docx
@@ -51,7 +51,7 @@
           <w:sz w:val="22"/>
           <w:szCs w:val="22"/>
         </w:rPr>
-        <w:t xml:space="preserve"> = do it on screen. Rough timing in brackets. ~1,350 words ≈ 9–10 minutes at a calm pace — trim the bracketed "optional" lines if running long.</w:t>
+        <w:t xml:space="preserve"> = do it on screen. Timing in brackets. Simple English (B2). ~1,300 words ≈ 9–10 minutes at a calm pace. Lines marked "optional" can be cut if you run long.</w:t>
       </w:r>
     </w:p>
     <w:p>
@@ -96,15 +96,15 @@
           <w:sz w:val="22"/>
           <w:szCs w:val="22"/>
         </w:rPr>
-        <w:t xml:space="preserve">hard-refresh</w:t>
-      </w:r>
-      <w:r>
-        <w:rPr>
-          <w:rFonts w:ascii="Calibri" w:cs="Calibri" w:eastAsia="Calibri" w:hAnsi="Calibri"/>
-          <w:sz w:val="22"/>
-          <w:szCs w:val="22"/>
-        </w:rPr>
-        <w:t xml:space="preserve"> it; open the </w:t>
+        <w:t xml:space="preserve">refresh</w:t>
+      </w:r>
+      <w:r>
+        <w:rPr>
+          <w:rFonts w:ascii="Calibri" w:cs="Calibri" w:eastAsia="Calibri" w:hAnsi="Calibri"/>
+          <w:sz w:val="22"/>
+          <w:szCs w:val="22"/>
+        </w:rPr>
+        <w:t xml:space="preserve"> it. Open the </w:t>
       </w:r>
       <w:r>
         <w:rPr>
@@ -158,7 +158,7 @@
           <w:sz w:val="22"/>
           <w:szCs w:val="22"/>
         </w:rPr>
-        <w:t xml:space="preserve"> so you're on the latest version.</w:t>
+        <w:t xml:space="preserve"> so you are on the latest version.</w:t>
       </w:r>
     </w:p>
     <w:p>
@@ -176,25 +176,25 @@
           <w:sz w:val="22"/>
           <w:szCs w:val="22"/>
         </w:rPr>
-        <w:t xml:space="preserve">Have </w:t>
-      </w:r>
-      <w:r>
-        <w:rPr>
-          <w:rFonts w:ascii="Calibri" w:cs="Calibri" w:eastAsia="Calibri" w:hAnsi="Calibri"/>
-          <w:b/>
-          <w:bCs/>
-          <w:sz w:val="22"/>
-          <w:szCs w:val="22"/>
-        </w:rPr>
-        <w:t xml:space="preserve">one photo of a damaged car saved on the desktop</w:t>
-      </w:r>
-      <w:r>
-        <w:rPr>
-          <w:rFonts w:ascii="Calibri" w:cs="Calibri" w:eastAsia="Calibri" w:hAnsi="Calibri"/>
-          <w:sz w:val="22"/>
-          <w:szCs w:val="22"/>
-        </w:rPr>
-        <w:t xml:space="preserve"> for the photo-inspection moment.</w:t>
+        <w:t xml:space="preserve">Save </w:t>
+      </w:r>
+      <w:r>
+        <w:rPr>
+          <w:rFonts w:ascii="Calibri" w:cs="Calibri" w:eastAsia="Calibri" w:hAnsi="Calibri"/>
+          <w:b/>
+          <w:bCs/>
+          <w:sz w:val="22"/>
+          <w:szCs w:val="22"/>
+        </w:rPr>
+        <w:t xml:space="preserve">one photo of a damaged car on the desktop</w:t>
+      </w:r>
+      <w:r>
+        <w:rPr>
+          <w:rFonts w:ascii="Calibri" w:cs="Calibri" w:eastAsia="Calibri" w:hAnsi="Calibri"/>
+          <w:sz w:val="22"/>
+          <w:szCs w:val="22"/>
+        </w:rPr>
+        <w:t xml:space="preserve"> for the photo moment.</w:t>
       </w:r>
     </w:p>
     <w:p>
@@ -222,15 +222,15 @@
           <w:sz w:val="22"/>
           <w:szCs w:val="22"/>
         </w:rPr>
-        <w:t xml:space="preserve">fresh test phone number</w:t>
-      </w:r>
-      <w:r>
-        <w:rPr>
-          <w:rFonts w:ascii="Calibri" w:cs="Calibri" w:eastAsia="Calibri" w:hAnsi="Calibri"/>
-          <w:sz w:val="22"/>
-          <w:szCs w:val="22"/>
-        </w:rPr>
-        <w:t xml:space="preserve"> you haven't used before for the lead step.</w:t>
+        <w:t xml:space="preserve">new test phone number</w:t>
+      </w:r>
+      <w:r>
+        <w:rPr>
+          <w:rFonts w:ascii="Calibri" w:cs="Calibri" w:eastAsia="Calibri" w:hAnsi="Calibri"/>
+          <w:sz w:val="22"/>
+          <w:szCs w:val="22"/>
+        </w:rPr>
+        <w:t xml:space="preserve"> that you have not used before for the lead step.</w:t>
       </w:r>
     </w:p>
     <w:p>
@@ -266,7 +266,7 @@
           <w:sz w:val="22"/>
           <w:szCs w:val="22"/>
         </w:rPr>
-        <w:t xml:space="preserve"> (type, don't dictate). If asked about voice, use the Q&amp;A answer below.</w:t>
+        <w:t xml:space="preserve"> (type, don't speak). If someone asks about voice, use the Q&amp;A answer below.</w:t>
       </w:r>
     </w:p>
     <w:p>
@@ -302,7 +302,7 @@
           <w:sz w:val="22"/>
           <w:szCs w:val="22"/>
         </w:rPr>
-        <w:t xml:space="preserve"> as backup in case of network problems.</w:t>
+        <w:t xml:space="preserve"> as a backup, in case of internet problems.</w:t>
       </w:r>
     </w:p>
     <w:p>
@@ -332,20 +332,33 @@
           <w:sz w:val="22"/>
           <w:szCs w:val="22"/>
         </w:rPr>
-        <w:t xml:space="preserve">Good morning, everyone. Before I show you any technology, let me describe a customer.</w:t>
-      </w:r>
-    </w:p>
-    <w:p>
-      <w:pPr>
-        <w:spacing w:after="150" w:line="300"/>
-      </w:pPr>
-      <w:r>
-        <w:rPr>
-          <w:rFonts w:ascii="Calibri" w:cs="Calibri" w:eastAsia="Calibri" w:hAnsi="Calibri"/>
-          <w:sz w:val="22"/>
-          <w:szCs w:val="22"/>
-        </w:rPr>
-        <w:t xml:space="preserve">He's in Madrid — or Tbilisi, or Dubai, it's the same story. He knows that cars at US auctions like Copart sell for a fraction of the local price, even after shipping. He's seen his neighbor do it. But when he tries himself, he hits a wall: listings in a foreign language, auction fees he doesn't understand, shipping, customs, repair costs — and no idea what the car will </w:t>
+        <w:t xml:space="preserve">Good morning, everyone. Before I show you any technology, let me tell you about a customer.</w:t>
+      </w:r>
+    </w:p>
+    <w:p>
+      <w:pPr>
+        <w:spacing w:after="150" w:line="300"/>
+      </w:pPr>
+      <w:r>
+        <w:rPr>
+          <w:rFonts w:ascii="Calibri" w:cs="Calibri" w:eastAsia="Calibri" w:hAnsi="Calibri"/>
+          <w:sz w:val="22"/>
+          <w:szCs w:val="22"/>
+        </w:rPr>
+        <w:t xml:space="preserve">He lives in Madrid — or Tbilisi, or Dubai. The story is the same everywhere. He knows that cars at US auctions like Copart are much cheaper than at home, even after shipping. His neighbor bought one. But when he tries it himself, he gets stuck. The listings are in a foreign language. The auction fees are confusing. Shipping, customs, repair costs — he doesn't know what the car will really cost until it is too late.</w:t>
+      </w:r>
+    </w:p>
+    <w:p>
+      <w:pPr>
+        <w:spacing w:after="150" w:line="300"/>
+      </w:pPr>
+      <w:r>
+        <w:rPr>
+          <w:rFonts w:ascii="Calibri" w:cs="Calibri" w:eastAsia="Calibri" w:hAnsi="Calibri"/>
+          <w:sz w:val="22"/>
+          <w:szCs w:val="22"/>
+        </w:rPr>
+        <w:t xml:space="preserve">So he calls a broker. And the broker's team spends hours every day answering the same three questions on the phone: </w:t>
       </w:r>
       <w:r>
         <w:rPr>
@@ -355,51 +368,20 @@
           <w:sz w:val="22"/>
           <w:szCs w:val="22"/>
         </w:rPr>
-        <w:t xml:space="preserve">really</w:t>
-      </w:r>
-      <w:r>
-        <w:rPr>
-          <w:rFonts w:ascii="Calibri" w:cs="Calibri" w:eastAsia="Calibri" w:hAnsi="Calibri"/>
-          <w:sz w:val="22"/>
-          <w:szCs w:val="22"/>
-        </w:rPr>
-        <w:t xml:space="preserve"> cost until it's too late.</w:t>
-      </w:r>
-    </w:p>
-    <w:p>
-      <w:pPr>
-        <w:spacing w:after="150" w:line="300"/>
-      </w:pPr>
-      <w:r>
-        <w:rPr>
-          <w:rFonts w:ascii="Calibri" w:cs="Calibri" w:eastAsia="Calibri" w:hAnsi="Calibri"/>
-          <w:sz w:val="22"/>
-          <w:szCs w:val="22"/>
-        </w:rPr>
-        <w:t xml:space="preserve">So he calls a broker. And the broker's team spends hours every day answering the same three questions on the phone: </w:t>
-      </w:r>
-      <w:r>
-        <w:rPr>
-          <w:rFonts w:ascii="Calibri" w:cs="Calibri" w:eastAsia="Calibri" w:hAnsi="Calibri"/>
-          <w:i/>
-          <w:iCs/>
-          <w:sz w:val="22"/>
-          <w:szCs w:val="22"/>
-        </w:rPr>
-        <w:t xml:space="preserve">what do you have, what will it really cost me, and is this car in good shape?</w:t>
-      </w:r>
-    </w:p>
-    <w:p>
-      <w:pPr>
-        <w:spacing w:after="150" w:line="300"/>
-      </w:pPr>
-      <w:r>
-        <w:rPr>
-          <w:rFonts w:ascii="Calibri" w:cs="Calibri" w:eastAsia="Calibri" w:hAnsi="Calibri"/>
-          <w:sz w:val="22"/>
-          <w:szCs w:val="22"/>
-        </w:rPr>
-        <w:t xml:space="preserve">That is the gap we built for.</w:t>
+        <w:t xml:space="preserve">what cars do you have, what will it really cost me, and is this car in good condition?</w:t>
+      </w:r>
+    </w:p>
+    <w:p>
+      <w:pPr>
+        <w:spacing w:after="150" w:line="300"/>
+      </w:pPr>
+      <w:r>
+        <w:rPr>
+          <w:rFonts w:ascii="Calibri" w:cs="Calibri" w:eastAsia="Calibri" w:hAnsi="Calibri"/>
+          <w:sz w:val="22"/>
+          <w:szCs w:val="22"/>
+        </w:rPr>
+        <w:t xml:space="preserve">That is the problem we built this product for.</w:t>
       </w:r>
     </w:p>
     <w:p>
@@ -447,33 +429,33 @@
           <w:sz w:val="22"/>
           <w:szCs w:val="22"/>
         </w:rPr>
-        <w:t xml:space="preserve"> — a conversational assistant that lives on the importer's website and does the qualification work of a junior broker, around the clock, in the customer's language.</w:t>
-      </w:r>
-    </w:p>
-    <w:p>
-      <w:pPr>
-        <w:spacing w:after="150" w:line="300"/>
-      </w:pPr>
-      <w:r>
-        <w:rPr>
-          <w:rFonts w:ascii="Calibri" w:cs="Calibri" w:eastAsia="Calibri" w:hAnsi="Calibri"/>
-          <w:sz w:val="22"/>
-          <w:szCs w:val="22"/>
-        </w:rPr>
-        <w:t xml:space="preserve">It searches real auction inventory — in this demo, over fifty-eight thousand real cars from Copart and IAAI. It shows photos and live auction links. It calculates the full to-the-door price — auction fees, towing, ocean freight, customs — for the customer's destination country. It estimates repair costs, and it can even look at a photo of the damage and price what it sees. And when the customer says "I want this one," it hands a fully prepared lead to a human broker.</w:t>
-      </w:r>
-    </w:p>
-    <w:p>
-      <w:pPr>
-        <w:spacing w:after="150" w:line="300"/>
-      </w:pPr>
-      <w:r>
-        <w:rPr>
-          <w:rFonts w:ascii="Calibri" w:cs="Calibri" w:eastAsia="Calibri" w:hAnsi="Calibri"/>
-          <w:sz w:val="22"/>
-          <w:szCs w:val="22"/>
-        </w:rPr>
-        <w:t xml:space="preserve">One design decision I want to highlight up front, because it's what makes this trustworthy: </w:t>
+        <w:t xml:space="preserve">. It is a chat assistant that lives on the importer's website. It does the work of a junior broker — but 24 hours a day, and in the customer's own language.</w:t>
+      </w:r>
+    </w:p>
+    <w:p>
+      <w:pPr>
+        <w:spacing w:after="150" w:line="300"/>
+      </w:pPr>
+      <w:r>
+        <w:rPr>
+          <w:rFonts w:ascii="Calibri" w:cs="Calibri" w:eastAsia="Calibri" w:hAnsi="Calibri"/>
+          <w:sz w:val="22"/>
+          <w:szCs w:val="22"/>
+        </w:rPr>
+        <w:t xml:space="preserve">It searches real auction inventory — in this demo, more than fifty-eight thousand real cars from Copart and IAAI. It shows photos and links to the auction pages. It calculates the full price to the customer's door — auction fees, transport, ocean shipping, customs. It estimates repair costs. It can even look at a photo of the damage and tell you what the repair will cost. And when the customer says "I want this one," it sends a ready lead to a human broker.</w:t>
+      </w:r>
+    </w:p>
+    <w:p>
+      <w:pPr>
+        <w:spacing w:after="150" w:line="300"/>
+      </w:pPr>
+      <w:r>
+        <w:rPr>
+          <w:rFonts w:ascii="Calibri" w:cs="Calibri" w:eastAsia="Calibri" w:hAnsi="Calibri"/>
+          <w:sz w:val="22"/>
+          <w:szCs w:val="22"/>
+        </w:rPr>
+        <w:t xml:space="preserve">One design decision is very important, and I want to say it clearly: </w:t>
       </w:r>
       <w:r>
         <w:rPr>
@@ -491,7 +473,7 @@
           <w:sz w:val="22"/>
           <w:szCs w:val="22"/>
         </w:rPr>
-        <w:t xml:space="preserve"> It informs, qualifies, and prepares. A certified human broker closes every deal. The AI makes the funnel wider and cheaper — the human stays where judgment and money are.</w:t>
+        <w:t xml:space="preserve"> It informs the customer and prepares the deal. A certified human broker closes every deal. The AI brings more customers in — the human stays in control of the money.</w:t>
       </w:r>
     </w:p>
     <w:p>
@@ -521,7 +503,7 @@
           <w:sz w:val="22"/>
           <w:szCs w:val="22"/>
         </w:rPr>
-        <w:t xml:space="preserve">Let me show you. This is a working product, live on the web right now — not slides.</w:t>
+        <w:t xml:space="preserve">Let me show you. This is a working product, live on the internet right now — not slides.</w:t>
       </w:r>
     </w:p>
     <w:p>
@@ -550,7 +532,7 @@
           <w:sz w:val="22"/>
           <w:szCs w:val="22"/>
         </w:rPr>
-        <w:t xml:space="preserve">This is our demo brand. In a real deployment this is </w:t>
+        <w:t xml:space="preserve">This is our demo brand. In a real project, this is </w:t>
       </w:r>
       <w:r>
         <w:rPr>
@@ -597,7 +579,7 @@
           <w:sz w:val="22"/>
           <w:szCs w:val="22"/>
         </w:rPr>
-        <w:t xml:space="preserve">I talk to it the way a customer actually talks. No forms, no filters, no dropdowns. Behind the scenes, it turns my sentence into a precise search over the auction inventory.</w:t>
+        <w:t xml:space="preserve">I write to it like I would talk to a person. No forms, no filters, no menus. Behind the scenes, it turns my sentence into an exact search over the auction inventory.</w:t>
       </w:r>
     </w:p>
     <w:p>
@@ -625,7 +607,7 @@
           <w:sz w:val="22"/>
           <w:szCs w:val="22"/>
         </w:rPr>
-        <w:t xml:space="preserve">Notice three things. First — these are real cars, with real damage descriptions, mileage, titles, locations. Second — the budget is respected exactly: I said twenty thousand, so nothing above twenty thousand. Third — under every car: photos, and a link straight to the live auction page. One click and the customer is looking at the actual lot.</w:t>
+        <w:t xml:space="preserve">Please notice three things. First — these are real cars, with real damage descriptions, mileage, titles, and locations. Second — the budget is respected exactly: I said twenty thousand, so nothing costs more than twenty thousand. Third — under every car there are photos and a link to the auction page. One click, and the customer sees the real lot.</w:t>
       </w:r>
     </w:p>
     <w:p>
@@ -654,7 +636,7 @@
           <w:sz w:val="22"/>
           <w:szCs w:val="22"/>
         </w:rPr>
-        <w:t xml:space="preserve">I didn't repeat the car's number — it remembers context, like a person would. "The second one," "that red one," "the one from Georgia" — all of that works.</w:t>
+        <w:t xml:space="preserve">I did not repeat the car's number. It remembers the conversation, like a person would. "The second one," "that red one" — all of that works.</w:t>
       </w:r>
     </w:p>
     <w:p>
@@ -683,33 +665,33 @@
           <w:sz w:val="22"/>
           <w:szCs w:val="22"/>
         </w:rPr>
-        <w:t xml:space="preserve">This is the killer question in this business, the one customers really care about — and here's the answer, itemized: winning bid, auction fees, inland towing, ocean freight, service fee, customs. Every line visible, nothing hidden.</w:t>
-      </w:r>
-    </w:p>
-    <w:p>
-      <w:pPr>
-        <w:spacing w:after="150" w:line="300"/>
-      </w:pPr>
-      <w:r>
-        <w:rPr>
-          <w:rFonts w:ascii="Calibri" w:cs="Calibri" w:eastAsia="Calibri" w:hAnsi="Calibri"/>
-          <w:sz w:val="22"/>
-          <w:szCs w:val="22"/>
-        </w:rPr>
-        <w:t xml:space="preserve">The customs math you see is configured per destination. For our demo corridor it's engine-size and age based excise. For a Spanish importer it would be EU duty plus VAT, calculated to Valencia or Algeciras. That's configuration — not new development.</w:t>
-      </w:r>
-    </w:p>
-    <w:p>
-      <w:pPr>
-        <w:spacing w:after="150" w:line="300"/>
-      </w:pPr>
-      <w:r>
-        <w:rPr>
-          <w:rFonts w:ascii="Calibri" w:cs="Calibri" w:eastAsia="Calibri" w:hAnsi="Calibri"/>
-          <w:sz w:val="22"/>
-          <w:szCs w:val="22"/>
-        </w:rPr>
-        <w:t xml:space="preserve">And note the honesty: it's labeled an estimate, and a certified broker confirms the final quote. The AI never over-promises.</w:t>
+        <w:t xml:space="preserve">This is the most important question in this business. And here is the answer, line by line: winning bid, auction fees, transport inside the US, ocean shipping, service fee, customs. Every line is visible. Nothing is hidden.</w:t>
+      </w:r>
+    </w:p>
+    <w:p>
+      <w:pPr>
+        <w:spacing w:after="150" w:line="300"/>
+      </w:pPr>
+      <w:r>
+        <w:rPr>
+          <w:rFonts w:ascii="Calibri" w:cs="Calibri" w:eastAsia="Calibri" w:hAnsi="Calibri"/>
+          <w:sz w:val="22"/>
+          <w:szCs w:val="22"/>
+        </w:rPr>
+        <w:t xml:space="preserve">The customs calculation is configured for each destination country. In our demo it uses engine size and age. For a Spanish importer, it would be EU duty plus VAT, calculated to Valencia or Algeciras. That is configuration — not new development.</w:t>
+      </w:r>
+    </w:p>
+    <w:p>
+      <w:pPr>
+        <w:spacing w:after="150" w:line="300"/>
+      </w:pPr>
+      <w:r>
+        <w:rPr>
+          <w:rFonts w:ascii="Calibri" w:cs="Calibri" w:eastAsia="Calibri" w:hAnsi="Calibri"/>
+          <w:sz w:val="22"/>
+          <w:szCs w:val="22"/>
+        </w:rPr>
+        <w:t xml:space="preserve">And please notice the honesty: it says this is an estimate, and a certified broker confirms the final price. The AI never promises too much.</w:t>
       </w:r>
     </w:p>
     <w:p>
@@ -738,7 +720,7 @@
           <w:sz w:val="22"/>
           <w:szCs w:val="22"/>
         </w:rPr>
-        <w:t xml:space="preserve">From the listing's damage description it gives an honest range. But now the part I like best.</w:t>
+        <w:t xml:space="preserve">From the damage description, it gives an honest price range. But now — the part I like the best.</w:t>
       </w:r>
     </w:p>
     <w:p>
@@ -767,7 +749,7 @@
           <w:sz w:val="22"/>
           <w:szCs w:val="22"/>
         </w:rPr>
-        <w:t xml:space="preserve">I just gave it a photo, and it's genuinely </w:t>
+        <w:t xml:space="preserve">I just gave it a photo, and it really </w:t>
       </w:r>
       <w:r>
         <w:rPr>
@@ -777,15 +759,15 @@
           <w:sz w:val="22"/>
           <w:szCs w:val="22"/>
         </w:rPr>
-        <w:t xml:space="preserve">looking</w:t>
-      </w:r>
-      <w:r>
-        <w:rPr>
-          <w:rFonts w:ascii="Calibri" w:cs="Calibri" w:eastAsia="Calibri" w:hAnsi="Calibri"/>
-          <w:sz w:val="22"/>
-          <w:szCs w:val="22"/>
-        </w:rPr>
-        <w:t xml:space="preserve"> at the car: which panels are hit, how severe it is, whether airbags deployed, whether the damage looks structural — and it prices each item. And it prices by make: a Porsche panel is not priced like a Corolla panel. This is the moment customers usually don't believe until they see it.</w:t>
+        <w:t xml:space="preserve">looks</w:t>
+      </w:r>
+      <w:r>
+        <w:rPr>
+          <w:rFonts w:ascii="Calibri" w:cs="Calibri" w:eastAsia="Calibri" w:hAnsi="Calibri"/>
+          <w:sz w:val="22"/>
+          <w:szCs w:val="22"/>
+        </w:rPr>
+        <w:t xml:space="preserve"> at the car. Which parts are damaged, how bad it is, whether the airbags opened, whether the frame may be damaged — and it gives a price for each item. And it prices by car brand: a Porsche part does not cost the same as a Corolla part. Customers usually don't believe this until they see it.</w:t>
       </w:r>
     </w:p>
     <w:p>
@@ -801,20 +783,20 @@
           <w:sz w:val="21"/>
           <w:szCs w:val="21"/>
         </w:rPr>
-        <w:t xml:space="preserve">► [DO: type — "OK, I want to buy it" → give name → give the fresh phone number]</w:t>
-      </w:r>
-    </w:p>
-    <w:p>
-      <w:pPr>
-        <w:spacing w:after="150" w:line="300"/>
-      </w:pPr>
-      <w:r>
-        <w:rPr>
-          <w:rFonts w:ascii="Calibri" w:cs="Calibri" w:eastAsia="Calibri" w:hAnsi="Calibri"/>
-          <w:sz w:val="22"/>
-          <w:szCs w:val="22"/>
-        </w:rPr>
-        <w:t xml:space="preserve">The moment of truth. It asks for a name and phone, confirms, and creates the lead with a reference number the customer can write down.</w:t>
+        <w:t xml:space="preserve">► [DO: type — "OK, I want to buy it" → give name → give the new phone number]</w:t>
+      </w:r>
+    </w:p>
+    <w:p>
+      <w:pPr>
+        <w:spacing w:after="150" w:line="300"/>
+      </w:pPr>
+      <w:r>
+        <w:rPr>
+          <w:rFonts w:ascii="Calibri" w:cs="Calibri" w:eastAsia="Calibri" w:hAnsi="Calibri"/>
+          <w:sz w:val="22"/>
+          <w:szCs w:val="22"/>
+        </w:rPr>
+        <w:t xml:space="preserve">Now the final step. It asks for a name and a phone number, confirms them, and creates the lead with a reference number the customer can write down.</w:t>
       </w:r>
     </w:p>
     <w:p>
@@ -843,20 +825,20 @@
           <w:sz w:val="22"/>
           <w:szCs w:val="22"/>
         </w:rPr>
-        <w:t xml:space="preserve">And here is the other side of the business: the broker's portal. The lead is already here — the exact car, its photo, the auction link, the customer's phone, the reference. Your broker calls back in minutes and starts the conversation at "let's do the paperwork" instead of "so what are you looking for?"</w:t>
-      </w:r>
-    </w:p>
-    <w:p>
-      <w:pPr>
-        <w:spacing w:after="150" w:line="300"/>
-      </w:pPr>
-      <w:r>
-        <w:rPr>
-          <w:rFonts w:ascii="Calibri" w:cs="Calibri" w:eastAsia="Calibri" w:hAnsi="Calibri"/>
-          <w:sz w:val="22"/>
-          <w:szCs w:val="22"/>
-        </w:rPr>
-        <w:t xml:space="preserve">That's the whole loop: anonymous visitor to qualified, car-specific lead — no human time spent.</w:t>
+        <w:t xml:space="preserve">And here is the other side of the business — the broker's portal. The lead is already here: the exact car, its photo, the auction link, the customer's phone, the reference number. Your broker calls back in a few minutes, and the conversation starts at "let's do the paperwork" — not at "so, what are you looking for?"</w:t>
+      </w:r>
+    </w:p>
+    <w:p>
+      <w:pPr>
+        <w:spacing w:after="150" w:line="300"/>
+      </w:pPr>
+      <w:r>
+        <w:rPr>
+          <w:rFonts w:ascii="Calibri" w:cs="Calibri" w:eastAsia="Calibri" w:hAnsi="Calibri"/>
+          <w:sz w:val="22"/>
+          <w:szCs w:val="22"/>
+        </w:rPr>
+        <w:t xml:space="preserve">That is the full loop: from an unknown website visitor to a ready lead for one specific car — with zero human time spent.</w:t>
       </w:r>
     </w:p>
     <w:p>
@@ -873,20 +855,20 @@
           <w:sz w:val="28"/>
           <w:szCs w:val="28"/>
         </w:rPr>
-        <w:t xml:space="preserve">4. How it's built, in one minute *(6:30 – 7:45)*</w:t>
-      </w:r>
-    </w:p>
-    <w:p>
-      <w:pPr>
-        <w:spacing w:after="150" w:line="300"/>
-      </w:pPr>
-      <w:r>
-        <w:rPr>
-          <w:rFonts w:ascii="Calibri" w:cs="Calibri" w:eastAsia="Calibri" w:hAnsi="Calibri"/>
-          <w:sz w:val="22"/>
-          <w:szCs w:val="22"/>
-        </w:rPr>
-        <w:t xml:space="preserve">For the technical people in the room, briefly.</w:t>
+        <w:t xml:space="preserve">4. How it is built — one minute *(6:30 – 7:45)*</w:t>
+      </w:r>
+    </w:p>
+    <w:p>
+      <w:pPr>
+        <w:spacing w:after="150" w:line="300"/>
+      </w:pPr>
+      <w:r>
+        <w:rPr>
+          <w:rFonts w:ascii="Calibri" w:cs="Calibri" w:eastAsia="Calibri" w:hAnsi="Calibri"/>
+          <w:sz w:val="22"/>
+          <w:szCs w:val="22"/>
+        </w:rPr>
+        <w:t xml:space="preserve">Now, briefly, for the technical people in the room.</w:t>
       </w:r>
     </w:p>
     <w:p>
@@ -917,38 +899,38 @@
           <w:sz w:val="22"/>
           <w:szCs w:val="22"/>
         </w:rPr>
-        <w:t xml:space="preserve"> — Google's enterprise agent platform with the Gemini model family; that's also what reads the damage photos. The assistant works through a set of strictly typed tools: search, car details, cost calculation, repair estimation, lead capture. Every fact about a car — price, mileage, damage — comes </w:t>
-      </w:r>
-      <w:r>
-        <w:rPr>
-          <w:rFonts w:ascii="Calibri" w:cs="Calibri" w:eastAsia="Calibri" w:hAnsi="Calibri"/>
-          <w:b/>
-          <w:bCs/>
-          <w:sz w:val="22"/>
-          <w:szCs w:val="22"/>
-        </w:rPr>
-        <w:t xml:space="preserve">directly from inventory data</w:t>
-      </w:r>
-      <w:r>
-        <w:rPr>
-          <w:rFonts w:ascii="Calibri" w:cs="Calibri" w:eastAsia="Calibri" w:hAnsi="Calibri"/>
-          <w:sz w:val="22"/>
-          <w:szCs w:val="22"/>
-        </w:rPr>
-        <w:t xml:space="preserve">, and every lead lands with an exact reference.</w:t>
-      </w:r>
-    </w:p>
-    <w:p>
-      <w:pPr>
-        <w:spacing w:after="150" w:line="300"/>
-      </w:pPr>
-      <w:r>
-        <w:rPr>
-          <w:rFonts w:ascii="Calibri" w:cs="Calibri" w:eastAsia="Calibri" w:hAnsi="Calibri"/>
-          <w:sz w:val="22"/>
-          <w:szCs w:val="22"/>
-        </w:rPr>
-        <w:t xml:space="preserve">Trust is engineered in: if the data doesn't state something — say, the color — it says so and points to the photos rather than speculating. It collects only a name and a phone number; transcripts are automatically redacted. It politely refuses everything outside its job — including bidding, payments, and financial advice.</w:t>
+        <w:t xml:space="preserve"> — Google's enterprise agent platform, with the Gemini model family. The same model also reads the damage photos. The assistant works through a fixed set of tools: search, car details, cost calculation, repair estimate, lead capture. Every fact about a car — the price, the mileage, the damage — comes </w:t>
+      </w:r>
+      <w:r>
+        <w:rPr>
+          <w:rFonts w:ascii="Calibri" w:cs="Calibri" w:eastAsia="Calibri" w:hAnsi="Calibri"/>
+          <w:b/>
+          <w:bCs/>
+          <w:sz w:val="22"/>
+          <w:szCs w:val="22"/>
+        </w:rPr>
+        <w:t xml:space="preserve">directly from the inventory data</w:t>
+      </w:r>
+      <w:r>
+        <w:rPr>
+          <w:rFonts w:ascii="Calibri" w:cs="Calibri" w:eastAsia="Calibri" w:hAnsi="Calibri"/>
+          <w:sz w:val="22"/>
+          <w:szCs w:val="22"/>
+        </w:rPr>
+        <w:t xml:space="preserve">. Every lead has an exact reference number.</w:t>
+      </w:r>
+    </w:p>
+    <w:p>
+      <w:pPr>
+        <w:spacing w:after="150" w:line="300"/>
+      </w:pPr>
+      <w:r>
+        <w:rPr>
+          <w:rFonts w:ascii="Calibri" w:cs="Calibri" w:eastAsia="Calibri" w:hAnsi="Calibri"/>
+          <w:sz w:val="22"/>
+          <w:szCs w:val="22"/>
+        </w:rPr>
+        <w:t xml:space="preserve">Trust is built in. If the data does not say something — for example, the color — the assistant says so and points to the photos. It does not guess. It collects only a name and a phone number, and the conversations are automatically cleaned of personal data. And it politely refuses everything outside its job — including bids, payments, and financial advice.</w:t>
       </w:r>
     </w:p>
     <w:p>
@@ -978,17 +960,17 @@
           <w:sz w:val="22"/>
           <w:szCs w:val="22"/>
         </w:rPr>
-        <w:t xml:space="preserve">Now the part that matters for this room: what you just saw is a </w:t>
-      </w:r>
-      <w:r>
-        <w:rPr>
-          <w:rFonts w:ascii="Calibri" w:cs="Calibri" w:eastAsia="Calibri" w:hAnsi="Calibri"/>
-          <w:b/>
-          <w:bCs/>
-          <w:sz w:val="22"/>
-          <w:szCs w:val="22"/>
-        </w:rPr>
-        <w:t xml:space="preserve">platform, not a one-off</w:t>
+        <w:t xml:space="preserve">Now the part that matters most for this room: what you just saw is a </w:t>
+      </w:r>
+      <w:r>
+        <w:rPr>
+          <w:rFonts w:ascii="Calibri" w:cs="Calibri" w:eastAsia="Calibri" w:hAnsi="Calibri"/>
+          <w:b/>
+          <w:bCs/>
+          <w:sz w:val="22"/>
+          <w:szCs w:val="22"/>
+        </w:rPr>
+        <w:t xml:space="preserve">platform, not a one-time project</w:t>
       </w:r>
       <w:r>
         <w:rPr>
@@ -1009,7 +991,7 @@
           <w:sz w:val="22"/>
           <w:szCs w:val="22"/>
         </w:rPr>
-        <w:t xml:space="preserve">Brand, greeting, languages, destination port, customs formulas, fee structure, broker callback promise — all of that is </w:t>
+        <w:t xml:space="preserve">The brand, the greeting, the languages, the destination port, the customs formulas, the fees — all of this is </w:t>
       </w:r>
       <w:r>
         <w:rPr>
@@ -1027,20 +1009,20 @@
           <w:sz w:val="22"/>
           <w:szCs w:val="22"/>
         </w:rPr>
-        <w:t xml:space="preserve">. The same engine that quotes excise for Georgia quotes EU duty plus VAT for Spain.</w:t>
-      </w:r>
-    </w:p>
-    <w:p>
-      <w:pPr>
-        <w:spacing w:after="150" w:line="300"/>
-      </w:pPr>
-      <w:r>
-        <w:rPr>
-          <w:rFonts w:ascii="Calibri" w:cs="Calibri" w:eastAsia="Calibri" w:hAnsi="Calibri"/>
-          <w:sz w:val="22"/>
-          <w:szCs w:val="22"/>
-        </w:rPr>
-        <w:t xml:space="preserve">Connecting your inventory takes one of two shapes, whichever fits your policies: </w:t>
+        <w:t xml:space="preserve">. The same engine that calculates customs for Georgia can calculate EU duty plus VAT for Spain.</w:t>
+      </w:r>
+    </w:p>
+    <w:p>
+      <w:pPr>
+        <w:spacing w:after="150" w:line="300"/>
+      </w:pPr>
+      <w:r>
+        <w:rPr>
+          <w:rFonts w:ascii="Calibri" w:cs="Calibri" w:eastAsia="Calibri" w:hAnsi="Calibri"/>
+          <w:sz w:val="22"/>
+          <w:szCs w:val="22"/>
+        </w:rPr>
+        <w:t xml:space="preserve">To connect your inventory, there are two options — you choose what fits your company. Option one: </w:t>
       </w:r>
       <w:r>
         <w:rPr>
@@ -1058,7 +1040,7 @@
           <w:sz w:val="22"/>
           <w:szCs w:val="22"/>
         </w:rPr>
-        <w:t xml:space="preserve"> and give us API access — or </w:t>
+        <w:t xml:space="preserve">, and we call your APIs. Option two: </w:t>
       </w:r>
       <w:r>
         <w:rPr>
@@ -1076,7 +1058,7 @@
           <w:sz w:val="22"/>
           <w:szCs w:val="22"/>
         </w:rPr>
-        <w:t xml:space="preserve"> and we host and sync it. Leads flow directly into </w:t>
+        <w:t xml:space="preserve">, and we host it and keep it in sync. Leads go directly into </w:t>
       </w:r>
       <w:r>
         <w:rPr>
@@ -1094,7 +1076,7 @@
           <w:sz w:val="22"/>
           <w:szCs w:val="22"/>
         </w:rPr>
-        <w:t xml:space="preserve"> — or you use the hosted broker portal you just saw. We have a full technical integration guide ready for your engineers; onboarding a pilot is measured in </w:t>
+        <w:t xml:space="preserve"> — or you use the broker portal you just saw. We have a full technical integration guide ready for your engineers. A pilot takes </w:t>
       </w:r>
       <w:r>
         <w:rPr>
@@ -1127,15 +1109,15 @@
           <w:sz w:val="22"/>
           <w:szCs w:val="22"/>
         </w:rPr>
-        <w:t xml:space="preserve">(Optional, if the audience is broader than automotive:)</w:t>
-      </w:r>
-      <w:r>
-        <w:rPr>
-          <w:rFonts w:ascii="Calibri" w:cs="Calibri" w:eastAsia="Calibri" w:hAnsi="Calibri"/>
-          <w:sz w:val="22"/>
-          <w:szCs w:val="22"/>
-        </w:rPr>
-        <w:t xml:space="preserve"> And one more thought — the pattern underneath is universal: search a large inventory, explain true costs, assess condition, qualify the customer, and hand a ready deal to a human expert. Cars today; the same engine fits real estate, equipment, any considered purchase with a specialist in the loop.</w:t>
+        <w:t xml:space="preserve">(Optional, if the audience is wider than automotive:)</w:t>
+      </w:r>
+      <w:r>
+        <w:rPr>
+          <w:rFonts w:ascii="Calibri" w:cs="Calibri" w:eastAsia="Calibri" w:hAnsi="Calibri"/>
+          <w:sz w:val="22"/>
+          <w:szCs w:val="22"/>
+        </w:rPr>
+        <w:t xml:space="preserve"> One more thought. The pattern under this product is universal: search a large inventory, explain the real costs, check the condition, prepare the customer, and hand the deal to a human expert. Today it is cars. The same engine works for real estate, machines — any expensive purchase where a specialist closes the deal.</w:t>
       </w:r>
     </w:p>
     <w:p>
@@ -1165,33 +1147,33 @@
           <w:sz w:val="22"/>
           <w:szCs w:val="22"/>
         </w:rPr>
-        <w:t xml:space="preserve">To sum up: customers get instant, honest answers in their own language at any hour. Brokers stop repeating themselves and receive prepared, car-specific leads. And the business gets a wider funnel at near-zero marginal cost per conversation.</w:t>
-      </w:r>
-    </w:p>
-    <w:p>
-      <w:pPr>
-        <w:spacing w:after="150" w:line="300"/>
-      </w:pPr>
-      <w:r>
-        <w:rPr>
-          <w:rFonts w:ascii="Calibri" w:cs="Calibri" w:eastAsia="Calibri" w:hAnsi="Calibri"/>
-          <w:sz w:val="22"/>
-          <w:szCs w:val="22"/>
-        </w:rPr>
-        <w:t xml:space="preserve">The demo is live on the public internet — I'll share the link, and I genuinely encourage you to try to confuse it over coffee.</w:t>
-      </w:r>
-    </w:p>
-    <w:p>
-      <w:pPr>
-        <w:spacing w:after="150" w:line="300"/>
-      </w:pPr>
-      <w:r>
-        <w:rPr>
-          <w:rFonts w:ascii="Calibri" w:cs="Calibri" w:eastAsia="Calibri" w:hAnsi="Calibri"/>
-          <w:sz w:val="22"/>
-          <w:szCs w:val="22"/>
-        </w:rPr>
-        <w:t xml:space="preserve">We'd love to configure a pilot on your brand and your inventory. Thank you — and I'm happy to take questions.</w:t>
+        <w:t xml:space="preserve">To sum up. Customers get instant, honest answers, in their own language, at any hour. Brokers stop repeating themselves and receive ready, car-specific leads. And the business gets more customers at almost zero extra cost per conversation.</w:t>
+      </w:r>
+    </w:p>
+    <w:p>
+      <w:pPr>
+        <w:spacing w:after="150" w:line="300"/>
+      </w:pPr>
+      <w:r>
+        <w:rPr>
+          <w:rFonts w:ascii="Calibri" w:cs="Calibri" w:eastAsia="Calibri" w:hAnsi="Calibri"/>
+          <w:sz w:val="22"/>
+          <w:szCs w:val="22"/>
+        </w:rPr>
+        <w:t xml:space="preserve">The demo is live on the public internet. I will share the link — please try to confuse it during the coffee break. I really mean it.</w:t>
+      </w:r>
+    </w:p>
+    <w:p>
+      <w:pPr>
+        <w:spacing w:after="150" w:line="300"/>
+      </w:pPr>
+      <w:r>
+        <w:rPr>
+          <w:rFonts w:ascii="Calibri" w:cs="Calibri" w:eastAsia="Calibri" w:hAnsi="Calibri"/>
+          <w:sz w:val="22"/>
+          <w:szCs w:val="22"/>
+        </w:rPr>
+        <w:t xml:space="preserve">We would love to configure a pilot with your brand and your inventory. Thank you — and I am happy to take questions.</w:t>
       </w:r>
     </w:p>
     <w:p>
@@ -1208,30 +1190,30 @@
           <w:sz w:val="28"/>
           <w:szCs w:val="28"/>
         </w:rPr>
-        <w:t xml:space="preserve">Q&amp;A cheat sheet *(not part of the 10 minutes)*</w:t>
-      </w:r>
-    </w:p>
-    <w:p>
-      <w:pPr>
-        <w:spacing w:after="150" w:line="300"/>
-      </w:pPr>
-      <w:r>
-        <w:rPr>
-          <w:rFonts w:ascii="Calibri" w:cs="Calibri" w:eastAsia="Calibri" w:hAnsi="Calibri"/>
-          <w:b/>
-          <w:bCs/>
-          <w:sz w:val="22"/>
-          <w:szCs w:val="22"/>
-        </w:rPr>
-        <w:t xml:space="preserve">"What if it quotes a wrong price?"</w:t>
-      </w:r>
-      <w:r>
-        <w:rPr>
-          <w:rFonts w:ascii="Calibri" w:cs="Calibri" w:eastAsia="Calibri" w:hAnsi="Calibri"/>
-          <w:sz w:val="22"/>
-          <w:szCs w:val="22"/>
-        </w:rPr>
-        <w:t xml:space="preserve"> — Every figure is labeled an estimate and built from data, not guessed; a certified broker confirms the final quote before any bid. The AI widens the funnel; the human owns the commitment.</w:t>
+        <w:t xml:space="preserve">Business Q&amp;A *(not part of the 10 minutes)*</w:t>
+      </w:r>
+    </w:p>
+    <w:p>
+      <w:pPr>
+        <w:spacing w:after="150" w:line="300"/>
+      </w:pPr>
+      <w:r>
+        <w:rPr>
+          <w:rFonts w:ascii="Calibri" w:cs="Calibri" w:eastAsia="Calibri" w:hAnsi="Calibri"/>
+          <w:b/>
+          <w:bCs/>
+          <w:sz w:val="22"/>
+          <w:szCs w:val="22"/>
+        </w:rPr>
+        <w:t xml:space="preserve">"What if it gives a wrong price?"</w:t>
+      </w:r>
+      <w:r>
+        <w:rPr>
+          <w:rFonts w:ascii="Calibri" w:cs="Calibri" w:eastAsia="Calibri" w:hAnsi="Calibri"/>
+          <w:sz w:val="22"/>
+          <w:szCs w:val="22"/>
+        </w:rPr>
+        <w:t xml:space="preserve"> — Every number is marked as an estimate and comes from data, not from guessing. A certified broker confirms the final price before any bid. The AI brings the customers in; the human makes the commitment.</w:t>
       </w:r>
     </w:p>
     <w:p>
@@ -1254,7 +1236,7 @@
           <w:sz w:val="22"/>
           <w:szCs w:val="22"/>
         </w:rPr>
-        <w:t xml:space="preserve"> — Language is configuration. The demo ships two; adding your market's language is part of onboarding, not development.</w:t>
+        <w:t xml:space="preserve"> — Language is configuration. The demo has two; adding your market's language is part of the setup, not new development.</w:t>
       </w:r>
     </w:p>
     <w:p>
@@ -1277,30 +1259,30 @@
           <w:sz w:val="22"/>
           <w:szCs w:val="22"/>
         </w:rPr>
-        <w:t xml:space="preserve"> — Then it never leaves you: in one integration mode we call your APIs and store nothing. The other mode — you ship us a feed — exists for partners who prefer not to run public APIs.</w:t>
-      </w:r>
-    </w:p>
-    <w:p>
-      <w:pPr>
-        <w:spacing w:after="150" w:line="300"/>
-      </w:pPr>
-      <w:r>
-        <w:rPr>
-          <w:rFonts w:ascii="Calibri" w:cs="Calibri" w:eastAsia="Calibri" w:hAnsi="Calibri"/>
-          <w:b/>
-          <w:bCs/>
-          <w:sz w:val="22"/>
-          <w:szCs w:val="22"/>
-        </w:rPr>
-        <w:t xml:space="preserve">"How long to launch a pilot?"</w:t>
-      </w:r>
-      <w:r>
-        <w:rPr>
-          <w:rFonts w:ascii="Calibri" w:cs="Calibri" w:eastAsia="Calibri" w:hAnsi="Calibri"/>
-          <w:sz w:val="22"/>
-          <w:szCs w:val="22"/>
-        </w:rPr>
-        <w:t xml:space="preserve"> — Weeks, not months. The fastest path: your API credentials or a data export, your fee schedule and customs rules, your branding — we configure and test together.</w:t>
+        <w:t xml:space="preserve"> — Then it never leaves you. In one integration option, we call your APIs and store nothing. The other option — sending us a data feed — is for partners who prefer not to run public APIs.</w:t>
+      </w:r>
+    </w:p>
+    <w:p>
+      <w:pPr>
+        <w:spacing w:after="150" w:line="300"/>
+      </w:pPr>
+      <w:r>
+        <w:rPr>
+          <w:rFonts w:ascii="Calibri" w:cs="Calibri" w:eastAsia="Calibri" w:hAnsi="Calibri"/>
+          <w:b/>
+          <w:bCs/>
+          <w:sz w:val="22"/>
+          <w:szCs w:val="22"/>
+        </w:rPr>
+        <w:t xml:space="preserve">"How long does a pilot take?"</w:t>
+      </w:r>
+      <w:r>
+        <w:rPr>
+          <w:rFonts w:ascii="Calibri" w:cs="Calibri" w:eastAsia="Calibri" w:hAnsi="Calibri"/>
+          <w:sz w:val="22"/>
+          <w:szCs w:val="22"/>
+        </w:rPr>
+        <w:t xml:space="preserve"> — Weeks, not months. The fastest path: your API access or a data export, your fee table and customs rules, your branding — and we configure and test it together.</w:t>
       </w:r>
     </w:p>
     <w:p>
@@ -1323,7 +1305,7 @@
           <w:sz w:val="22"/>
           <w:szCs w:val="22"/>
         </w:rPr>
-        <w:t xml:space="preserve"> — Depends on integration mode and volume; the honest answer is a scoping conversation. The demo itself runs on standard Google Cloud infrastructure with predictable per-conversation costs.</w:t>
+        <w:t xml:space="preserve"> — It depends on the integration option and the volume. The honest answer is a short scoping call. The running costs are standard Google Cloud costs, predictable per conversation.</w:t>
       </w:r>
     </w:p>
     <w:p>
@@ -1346,7 +1328,7 @@
           <w:sz w:val="22"/>
           <w:szCs w:val="22"/>
         </w:rPr>
-        <w:t xml:space="preserve"> — It holds voice conversations today, and full voice-driven search is on the production roadmap. For pilots we lead with chat, which is where customers convert best anyway.</w:t>
+        <w:t xml:space="preserve"> — It can hold a voice conversation today, and full voice search is on the production roadmap. For pilots we start with chat, because that is where customers convert best anyway.</w:t>
       </w:r>
     </w:p>
     <w:p>
@@ -1369,53 +1351,53 @@
           <w:sz w:val="22"/>
           <w:szCs w:val="22"/>
         </w:rPr>
-        <w:t xml:space="preserve"> — Deliberately no. Bidding and payments stay with certified humans — that's a trust and compliance feature, not a limitation.</w:t>
-      </w:r>
-    </w:p>
-    <w:p>
-      <w:pPr>
-        <w:spacing w:after="150" w:line="300"/>
-      </w:pPr>
-      <w:r>
-        <w:rPr>
-          <w:rFonts w:ascii="Calibri" w:cs="Calibri" w:eastAsia="Calibri" w:hAnsi="Calibri"/>
-          <w:b/>
-          <w:bCs/>
-          <w:sz w:val="22"/>
-          <w:szCs w:val="22"/>
-        </w:rPr>
-        <w:t xml:space="preserve">"What if the customer doesn't pick a car?"</w:t>
-      </w:r>
-      <w:r>
-        <w:rPr>
-          <w:rFonts w:ascii="Calibri" w:cs="Calibri" w:eastAsia="Calibri" w:hAnsi="Calibri"/>
-          <w:sz w:val="22"/>
-          <w:szCs w:val="22"/>
-        </w:rPr>
-        <w:t xml:space="preserve"> — It still captures the lead with their criteria — "black Toyota hybrid, up to eighteen thousand" — so the broker can hunt for them. No conversation is wasted.</w:t>
-      </w:r>
-    </w:p>
-    <w:p>
-      <w:pPr>
-        <w:spacing w:after="150" w:line="300"/>
-      </w:pPr>
-      <w:r>
-        <w:rPr>
-          <w:rFonts w:ascii="Calibri" w:cs="Calibri" w:eastAsia="Calibri" w:hAnsi="Calibri"/>
-          <w:b/>
-          <w:bCs/>
-          <w:sz w:val="22"/>
-          <w:szCs w:val="22"/>
-        </w:rPr>
-        <w:t xml:space="preserve">"What about scale — we have millions of vehicles?"</w:t>
-      </w:r>
-      <w:r>
-        <w:rPr>
-          <w:rFonts w:ascii="Calibri" w:cs="Calibri" w:eastAsia="Calibri" w:hAnsi="Calibri"/>
-          <w:sz w:val="22"/>
-          <w:szCs w:val="22"/>
-        </w:rPr>
-        <w:t xml:space="preserve"> — The demo carries fifty-eight thousand cars; the production architecture queries a live database and scales to millions, with prices always current.</w:t>
+        <w:t xml:space="preserve"> — No, and that is by design. Bids and payments stay with certified humans. It is a trust feature, not a missing feature.</w:t>
+      </w:r>
+    </w:p>
+    <w:p>
+      <w:pPr>
+        <w:spacing w:after="150" w:line="300"/>
+      </w:pPr>
+      <w:r>
+        <w:rPr>
+          <w:rFonts w:ascii="Calibri" w:cs="Calibri" w:eastAsia="Calibri" w:hAnsi="Calibri"/>
+          <w:b/>
+          <w:bCs/>
+          <w:sz w:val="22"/>
+          <w:szCs w:val="22"/>
+        </w:rPr>
+        <w:t xml:space="preserve">"What if the customer doesn't choose a car?"</w:t>
+      </w:r>
+      <w:r>
+        <w:rPr>
+          <w:rFonts w:ascii="Calibri" w:cs="Calibri" w:eastAsia="Calibri" w:hAnsi="Calibri"/>
+          <w:sz w:val="22"/>
+          <w:szCs w:val="22"/>
+        </w:rPr>
+        <w:t xml:space="preserve"> — The assistant still saves the lead with the customer's wishes — "black Toyota hybrid, up to eighteen thousand" — so the broker can search for them. No conversation is wasted.</w:t>
+      </w:r>
+    </w:p>
+    <w:p>
+      <w:pPr>
+        <w:spacing w:after="150" w:line="300"/>
+      </w:pPr>
+      <w:r>
+        <w:rPr>
+          <w:rFonts w:ascii="Calibri" w:cs="Calibri" w:eastAsia="Calibri" w:hAnsi="Calibri"/>
+          <w:b/>
+          <w:bCs/>
+          <w:sz w:val="22"/>
+          <w:szCs w:val="22"/>
+        </w:rPr>
+        <w:t xml:space="preserve">"We have millions of vehicles — does it scale?"</w:t>
+      </w:r>
+      <w:r>
+        <w:rPr>
+          <w:rFonts w:ascii="Calibri" w:cs="Calibri" w:eastAsia="Calibri" w:hAnsi="Calibri"/>
+          <w:sz w:val="22"/>
+          <w:szCs w:val="22"/>
+        </w:rPr>
+        <w:t xml:space="preserve"> — The demo carries fifty-eight thousand cars. The production version reads from a live database and scales to millions, with prices always up to date.</w:t>
       </w:r>
     </w:p>
     <w:p>
@@ -1438,7 +1420,300 @@
           <w:sz w:val="22"/>
           <w:szCs w:val="22"/>
         </w:rPr>
-        <w:t xml:space="preserve"> — Google Cloud, in a region agreed by contract. Only a name and phone are collected; transcripts are automatically redacted; nothing is sold or shared.</w:t>
+        <w:t xml:space="preserve"> — Google Cloud, in a region we agree on in the contract. Only a name and phone number are collected. Conversations are automatically cleaned of personal data. Nothing is sold or shared.</w:t>
+      </w:r>
+    </w:p>
+    <w:p>
+      <w:pPr>
+        <w:pStyle w:val="Heading1"/>
+        <w:spacing w:after="120" w:before="300"/>
+      </w:pPr>
+      <w:r>
+        <w:rPr>
+          <w:rFonts w:ascii="Calibri" w:cs="Calibri" w:eastAsia="Calibri" w:hAnsi="Calibri"/>
+          <w:b/>
+          <w:bCs/>
+          <w:color w:val="073763"/>
+          <w:sz w:val="28"/>
+          <w:szCs w:val="28"/>
+        </w:rPr>
+        <w:t xml:space="preserve">Technical Q&amp;A *(for engineers and CTOs)*</w:t>
+      </w:r>
+    </w:p>
+    <w:p>
+      <w:pPr>
+        <w:spacing w:after="150" w:line="300"/>
+      </w:pPr>
+      <w:r>
+        <w:rPr>
+          <w:rFonts w:ascii="Calibri" w:cs="Calibri" w:eastAsia="Calibri" w:hAnsi="Calibri"/>
+          <w:b/>
+          <w:bCs/>
+          <w:sz w:val="22"/>
+          <w:szCs w:val="22"/>
+        </w:rPr>
+        <w:t xml:space="preserve">"What is the technology stack?"</w:t>
+      </w:r>
+      <w:r>
+        <w:rPr>
+          <w:rFonts w:ascii="Calibri" w:cs="Calibri" w:eastAsia="Calibri" w:hAnsi="Calibri"/>
+          <w:sz w:val="22"/>
+          <w:szCs w:val="22"/>
+        </w:rPr>
+        <w:t xml:space="preserve"> — Google CX Agent Studio (Google's enterprise agent platform) with the Gemini model family. The assistant's tools are typed Python functions: search, car details, cost calculation, repair estimate, lead capture. The demo website is simple HTML and JavaScript.</w:t>
+      </w:r>
+    </w:p>
+    <w:p>
+      <w:pPr>
+        <w:spacing w:after="150" w:line="300"/>
+      </w:pPr>
+      <w:r>
+        <w:rPr>
+          <w:rFonts w:ascii="Calibri" w:cs="Calibri" w:eastAsia="Calibri" w:hAnsi="Calibri"/>
+          <w:b/>
+          <w:bCs/>
+          <w:sz w:val="22"/>
+          <w:szCs w:val="22"/>
+        </w:rPr>
+        <w:t xml:space="preserve">"Which model do you use? Can we choose?"</w:t>
+      </w:r>
+      <w:r>
+        <w:rPr>
+          <w:rFonts w:ascii="Calibri" w:cs="Calibri" w:eastAsia="Calibri" w:hAnsi="Calibri"/>
+          <w:sz w:val="22"/>
+          <w:szCs w:val="22"/>
+        </w:rPr>
+        <w:t xml:space="preserve"> — Gemini, natively multimodal — the same model reads the damage photos. On the managed platform the model is set by Google; in the production setup (our own runtime on Cloud Run), the model can be selected per client.</w:t>
+      </w:r>
+    </w:p>
+    <w:p>
+      <w:pPr>
+        <w:spacing w:after="150" w:line="300"/>
+      </w:pPr>
+      <w:r>
+        <w:rPr>
+          <w:rFonts w:ascii="Calibri" w:cs="Calibri" w:eastAsia="Calibri" w:hAnsi="Calibri"/>
+          <w:b/>
+          <w:bCs/>
+          <w:sz w:val="22"/>
+          <w:szCs w:val="22"/>
+        </w:rPr>
+        <w:t xml:space="preserve">"Where does the car data come from? Is it live?"</w:t>
+      </w:r>
+      <w:r>
+        <w:rPr>
+          <w:rFonts w:ascii="Calibri" w:cs="Calibri" w:eastAsia="Calibri" w:hAnsi="Calibri"/>
+          <w:sz w:val="22"/>
+          <w:szCs w:val="22"/>
+        </w:rPr>
+        <w:t xml:space="preserve"> — In the demo, the inventory is a snapshot of about fifty-eight thousand real auction lots. In production, the agent reads from a live database or from your APIs, with prices refreshed within minutes. The two integration options are described in our integration guide.</w:t>
+      </w:r>
+    </w:p>
+    <w:p>
+      <w:pPr>
+        <w:spacing w:after="150" w:line="300"/>
+      </w:pPr>
+      <w:r>
+        <w:rPr>
+          <w:rFonts w:ascii="Calibri" w:cs="Calibri" w:eastAsia="Calibri" w:hAnsi="Calibri"/>
+          <w:b/>
+          <w:bCs/>
+          <w:sz w:val="22"/>
+          <w:szCs w:val="22"/>
+        </w:rPr>
+        <w:t xml:space="preserve">"How do you make sure the answers match the data?"</w:t>
+      </w:r>
+      <w:r>
+        <w:rPr>
+          <w:rFonts w:ascii="Calibri" w:cs="Calibri" w:eastAsia="Calibri" w:hAnsi="Calibri"/>
+          <w:sz w:val="22"/>
+          <w:szCs w:val="22"/>
+        </w:rPr>
+        <w:t xml:space="preserve"> — The assistant can only present cars that come back from a tool call, and the tools apply exact filters — a $15,000 budget can never return a $16,000 car. Price, mileage, and damage come from the data fields, not from the model's imagination of the text.</w:t>
+      </w:r>
+    </w:p>
+    <w:p>
+      <w:pPr>
+        <w:spacing w:after="150" w:line="300"/>
+      </w:pPr>
+      <w:r>
+        <w:rPr>
+          <w:rFonts w:ascii="Calibri" w:cs="Calibri" w:eastAsia="Calibri" w:hAnsi="Calibri"/>
+          <w:b/>
+          <w:bCs/>
+          <w:sz w:val="22"/>
+          <w:szCs w:val="22"/>
+        </w:rPr>
+        <w:t xml:space="preserve">"How does the photo analysis work?"</w:t>
+      </w:r>
+      <w:r>
+        <w:rPr>
+          <w:rFonts w:ascii="Calibri" w:cs="Calibri" w:eastAsia="Calibri" w:hAnsi="Calibri"/>
+          <w:sz w:val="22"/>
+          <w:szCs w:val="22"/>
+        </w:rPr>
+        <w:t xml:space="preserve"> — The model is multimodal, so it sees the uploaded image directly — no separate vision API. It identifies the damaged areas and the severity. The prices themselves come from a deterministic pricing tool, so the numbers are stable and adjustable. The model does the seeing; the tool does the money.</w:t>
+      </w:r>
+    </w:p>
+    <w:p>
+      <w:pPr>
+        <w:spacing w:after="150" w:line="300"/>
+      </w:pPr>
+      <w:r>
+        <w:rPr>
+          <w:rFonts w:ascii="Calibri" w:cs="Calibri" w:eastAsia="Calibri" w:hAnsi="Calibri"/>
+          <w:b/>
+          <w:bCs/>
+          <w:sz w:val="22"/>
+          <w:szCs w:val="22"/>
+        </w:rPr>
+        <w:t xml:space="preserve">"What about prompt injection and security?"</w:t>
+      </w:r>
+      <w:r>
+        <w:rPr>
+          <w:rFonts w:ascii="Calibri" w:cs="Calibri" w:eastAsia="Calibri" w:hAnsi="Calibri"/>
+          <w:sz w:val="22"/>
+          <w:szCs w:val="22"/>
+        </w:rPr>
+        <w:t xml:space="preserve"> — Text inside listings or user messages is treated as data, never as instructions. There are dedicated guardrails for prompt security and content safety, plus rules that stop the assistant from revealing its configuration. Personal data in transcripts is automatically redacted with Google DLP.</w:t>
+      </w:r>
+    </w:p>
+    <w:p>
+      <w:pPr>
+        <w:spacing w:after="150" w:line="300"/>
+      </w:pPr>
+      <w:r>
+        <w:rPr>
+          <w:rFonts w:ascii="Calibri" w:cs="Calibri" w:eastAsia="Calibri" w:hAnsi="Calibri"/>
+          <w:b/>
+          <w:bCs/>
+          <w:sz w:val="22"/>
+          <w:szCs w:val="22"/>
+        </w:rPr>
+        <w:t xml:space="preserve">"What are the API requirements on our side?"</w:t>
+      </w:r>
+      <w:r>
+        <w:rPr>
+          <w:rFonts w:ascii="Calibri" w:cs="Calibri" w:eastAsia="Calibri" w:hAnsi="Calibri"/>
+          <w:sz w:val="22"/>
+          <w:szCs w:val="22"/>
+        </w:rPr>
+        <w:t xml:space="preserve"> — Three main endpoints: search with exact filters, lot detail, and lead intake with idempotency (a retry must not create a duplicate lead). Plus a list of your damage and title values, and photo URLs that our systems can access. It is all written down in the integration guide, with a test checklist.</w:t>
+      </w:r>
+    </w:p>
+    <w:p>
+      <w:pPr>
+        <w:spacing w:after="150" w:line="300"/>
+      </w:pPr>
+      <w:r>
+        <w:rPr>
+          <w:rFonts w:ascii="Calibri" w:cs="Calibri" w:eastAsia="Calibri" w:hAnsi="Calibri"/>
+          <w:b/>
+          <w:bCs/>
+          <w:sz w:val="22"/>
+          <w:szCs w:val="22"/>
+        </w:rPr>
+        <w:t xml:space="preserve">"How does lead delivery work reliably?"</w:t>
+      </w:r>
+      <w:r>
+        <w:rPr>
+          <w:rFonts w:ascii="Calibri" w:cs="Calibri" w:eastAsia="Calibri" w:hAnsi="Calibri"/>
+          <w:sz w:val="22"/>
+          <w:szCs w:val="22"/>
+        </w:rPr>
+        <w:t xml:space="preserve"> — Lead creation is idempotent and has a retry queue: if your CRM endpoint is down, we retry and hold the lead until it is delivered — a lead is never silently lost. Optionally you can push status updates back to us (contacted, won, lost).</w:t>
+      </w:r>
+    </w:p>
+    <w:p>
+      <w:pPr>
+        <w:spacing w:after="150" w:line="300"/>
+      </w:pPr>
+      <w:r>
+        <w:rPr>
+          <w:rFonts w:ascii="Calibri" w:cs="Calibri" w:eastAsia="Calibri" w:hAnsi="Calibri"/>
+          <w:b/>
+          <w:bCs/>
+          <w:sz w:val="22"/>
+          <w:szCs w:val="22"/>
+        </w:rPr>
+        <w:t xml:space="preserve">"What about latency and scale?"</w:t>
+      </w:r>
+      <w:r>
+        <w:rPr>
+          <w:rFonts w:ascii="Calibri" w:cs="Calibri" w:eastAsia="Calibri" w:hAnsi="Calibri"/>
+          <w:sz w:val="22"/>
+          <w:szCs w:val="22"/>
+        </w:rPr>
+        <w:t xml:space="preserve"> — On the managed platform, one conversation turn takes a few seconds, like any chat assistant. For production scale we recommend our own runtime with a database plus a search index — millions of vehicles, sub-second search, and full control of quotas.</w:t>
+      </w:r>
+    </w:p>
+    <w:p>
+      <w:pPr>
+        <w:spacing w:after="150" w:line="300"/>
+      </w:pPr>
+      <w:r>
+        <w:rPr>
+          <w:rFonts w:ascii="Calibri" w:cs="Calibri" w:eastAsia="Calibri" w:hAnsi="Calibri"/>
+          <w:b/>
+          <w:bCs/>
+          <w:sz w:val="22"/>
+          <w:szCs w:val="22"/>
+        </w:rPr>
+        <w:t xml:space="preserve">"Can we run it on-premise?"</w:t>
+      </w:r>
+      <w:r>
+        <w:rPr>
+          <w:rFonts w:ascii="Calibri" w:cs="Calibri" w:eastAsia="Calibri" w:hAnsi="Calibri"/>
+          <w:sz w:val="22"/>
+          <w:szCs w:val="22"/>
+        </w:rPr>
+        <w:t xml:space="preserve"> — The platform is Google Cloud. What we can do: run it in a dedicated Google Cloud project, in a region you choose, with your data isolated per contract. Full on-premise is not part of this product today.</w:t>
+      </w:r>
+    </w:p>
+    <w:p>
+      <w:pPr>
+        <w:spacing w:after="150" w:line="300"/>
+      </w:pPr>
+      <w:r>
+        <w:rPr>
+          <w:rFonts w:ascii="Calibri" w:cs="Calibri" w:eastAsia="Calibri" w:hAnsi="Calibri"/>
+          <w:b/>
+          <w:bCs/>
+          <w:sz w:val="22"/>
+          <w:szCs w:val="22"/>
+        </w:rPr>
+        <w:t xml:space="preserve">"What happens if the AI service is down?"</w:t>
+      </w:r>
+      <w:r>
+        <w:rPr>
+          <w:rFonts w:ascii="Calibri" w:cs="Calibri" w:eastAsia="Calibri" w:hAnsi="Calibri"/>
+          <w:sz w:val="22"/>
+          <w:szCs w:val="22"/>
+        </w:rPr>
+        <w:t xml:space="preserve"> — The website keeps working — inventory, calculator, and the broker's contact details are all independent of the chat. The chat shows a retry message, and no lead that was already created is lost.</w:t>
+      </w:r>
+    </w:p>
+    <w:p>
+      <w:pPr>
+        <w:spacing w:after="150" w:line="300"/>
+      </w:pPr>
+      <w:r>
+        <w:rPr>
+          <w:rFonts w:ascii="Calibri" w:cs="Calibri" w:eastAsia="Calibri" w:hAnsi="Calibri"/>
+          <w:b/>
+          <w:bCs/>
+          <w:sz w:val="22"/>
+          <w:szCs w:val="22"/>
+        </w:rPr>
+        <w:t xml:space="preserve">"How do you test changes?"</w:t>
+      </w:r>
+      <w:r>
+        <w:rPr>
+          <w:rFonts w:ascii="Calibri" w:cs="Calibri" w:eastAsia="Calibri" w:hAnsi="Calibri"/>
+          <w:sz w:val="22"/>
+          <w:szCs w:val="22"/>
+        </w:rPr>
+        <w:t xml:space="preserve"> — Every change ships as a new version, and the live widget points to a fixed version — so we test first and release consciously. We also keep evaluation scenarios (search, refusals, lead capture) that we run against the agent after changes.</w:t>
       </w:r>
     </w:p>
     <w:sectPr>

</xml_diff>